<commit_message>
docs: add detailed project README, feature screenshots gallery and system architecture diagrams
</commit_message>
<xml_diff>
--- a/Study_AI_系统分析与设计课程报告.docx
+++ b/Study_AI_系统分析与设计课程报告.docx
@@ -406,8 +406,6 @@
         </w:rPr>
         <w:t>武星艳</w:t>
       </w:r>
-      <w:bookmarkStart w:id="53" w:name="_GoBack"/>
-      <w:bookmarkEnd w:id="53"/>
     </w:p>
     <w:sdt>
       <w:sdtPr>
@@ -3348,8 +3346,8 @@
           <w:szCs w:val="28"/>
         </w:rPr>
       </w:pPr>
-      <w:bookmarkStart w:id="11" w:name="_Toc18067"/>
-      <w:bookmarkStart w:id="12" w:name="_Toc13074"/>
+      <w:bookmarkStart w:id="11" w:name="_Toc13074"/>
+      <w:bookmarkStart w:id="12" w:name="_Toc18067"/>
       <w:r>
         <w:rPr>
           <w:rFonts w:eastAsia="黑体"/>
@@ -4282,8 +4280,8 @@
           <w:szCs w:val="28"/>
         </w:rPr>
       </w:pPr>
-      <w:bookmarkStart w:id="28" w:name="_Toc26023"/>
-      <w:bookmarkStart w:id="29" w:name="_Toc13782"/>
+      <w:bookmarkStart w:id="28" w:name="_Toc13782"/>
+      <w:bookmarkStart w:id="29" w:name="_Toc26023"/>
       <w:r>
         <w:rPr>
           <w:rFonts w:hint="eastAsia" w:eastAsia="黑体"/>
@@ -4419,22 +4417,34 @@
         <w:spacing w:line="460" w:lineRule="exact"/>
         <w:ind w:firstLine="480" w:firstLineChars="200"/>
         <w:rPr>
-          <w:sz w:val="24"/>
-        </w:rPr>
-      </w:pPr>
-      <w:r>
-        <w:rPr>
           <w:rFonts w:hint="eastAsia"/>
           <w:sz w:val="24"/>
         </w:rPr>
+      </w:pPr>
+      <w:r>
+        <w:rPr>
+          <w:rFonts w:hint="eastAsia"/>
+          <w:sz w:val="24"/>
+        </w:rPr>
         <w:t>系统管理员与教师角色用例图如图 2-1 所示。</w:t>
       </w:r>
     </w:p>
     <w:p>
       <w:pPr>
         <w:spacing w:line="460" w:lineRule="exact"/>
+        <w:ind w:firstLine="480" w:firstLineChars="200"/>
+        <w:rPr>
+          <w:rFonts w:hint="eastAsia"/>
+          <w:sz w:val="24"/>
+        </w:rPr>
+      </w:pPr>
+    </w:p>
+    <w:p>
+      <w:pPr>
+        <w:spacing w:line="460" w:lineRule="exact"/>
         <w:ind w:firstLine="420" w:firstLineChars="200"/>
         <w:rPr>
+          <w:rFonts w:hint="eastAsia"/>
           <w:sz w:val="24"/>
         </w:rPr>
       </w:pPr>
@@ -4443,10 +4453,10 @@
           <wp:anchor distT="0" distB="0" distL="114300" distR="114300" simplePos="0" relativeHeight="251659264" behindDoc="0" locked="0" layoutInCell="1" allowOverlap="1">
             <wp:simplePos x="0" y="0"/>
             <wp:positionH relativeFrom="page">
-              <wp:posOffset>2321560</wp:posOffset>
+              <wp:posOffset>2118360</wp:posOffset>
             </wp:positionH>
             <wp:positionV relativeFrom="paragraph">
-              <wp:posOffset>135255</wp:posOffset>
+              <wp:posOffset>173355</wp:posOffset>
             </wp:positionV>
             <wp:extent cx="3236595" cy="2170430"/>
             <wp:effectExtent l="0" t="0" r="1905" b="1270"/>
@@ -4499,46 +4509,145 @@
     </w:p>
     <w:p>
       <w:pPr>
-        <w:spacing w:line="20" w:lineRule="exact" w:before="0" w:after="0"/>
+        <w:spacing w:line="460" w:lineRule="exact"/>
         <w:ind w:firstLine="480" w:firstLineChars="200"/>
         <w:rPr>
-          <w:sz w:val="24"/>
-        </w:rPr>
-      </w:pPr>
-    </w:p>
-    <w:p>
-      <w:pPr>
-        <w:spacing w:line="20" w:lineRule="exact" w:before="0" w:after="0"/>
+          <w:rFonts w:hint="eastAsia"/>
+          <w:sz w:val="24"/>
+        </w:rPr>
+      </w:pPr>
+    </w:p>
+    <w:p>
+      <w:pPr>
+        <w:spacing w:line="460" w:lineRule="exact"/>
+        <w:ind w:firstLine="480" w:firstLineChars="200"/>
+        <w:rPr>
+          <w:rFonts w:hint="eastAsia"/>
+          <w:sz w:val="24"/>
+        </w:rPr>
+      </w:pPr>
+    </w:p>
+    <w:p>
+      <w:pPr>
+        <w:spacing w:line="460" w:lineRule="exact"/>
+        <w:ind w:firstLine="480" w:firstLineChars="200"/>
+        <w:rPr>
+          <w:rFonts w:hint="eastAsia"/>
+          <w:sz w:val="24"/>
+        </w:rPr>
+      </w:pPr>
+    </w:p>
+    <w:p>
+      <w:pPr>
+        <w:spacing w:line="460" w:lineRule="exact"/>
+        <w:ind w:firstLine="480" w:firstLineChars="200"/>
+        <w:rPr>
+          <w:rFonts w:hint="eastAsia"/>
+          <w:sz w:val="24"/>
+        </w:rPr>
+      </w:pPr>
+    </w:p>
+    <w:p>
+      <w:pPr>
+        <w:spacing w:line="460" w:lineRule="exact"/>
+        <w:ind w:firstLine="480" w:firstLineChars="200"/>
+        <w:rPr>
+          <w:rFonts w:hint="eastAsia"/>
+          <w:sz w:val="24"/>
+        </w:rPr>
+      </w:pPr>
+    </w:p>
+    <w:p>
+      <w:pPr>
+        <w:spacing w:line="460" w:lineRule="exact"/>
+        <w:ind w:firstLine="480" w:firstLineChars="200"/>
+        <w:rPr>
+          <w:rFonts w:hint="eastAsia"/>
+          <w:sz w:val="24"/>
+        </w:rPr>
+      </w:pPr>
+    </w:p>
+    <w:p>
+      <w:pPr>
+        <w:spacing w:line="460" w:lineRule="exact"/>
+        <w:ind w:firstLine="480" w:firstLineChars="200"/>
+        <w:rPr>
+          <w:rFonts w:hint="eastAsia"/>
+          <w:sz w:val="24"/>
+        </w:rPr>
+      </w:pPr>
+    </w:p>
+    <w:p>
+      <w:pPr>
+        <w:spacing w:line="460" w:lineRule="exact"/>
+        <w:ind w:firstLine="480" w:firstLineChars="200"/>
+        <w:rPr>
+          <w:rFonts w:hint="eastAsia"/>
+          <w:sz w:val="24"/>
+        </w:rPr>
+      </w:pPr>
+    </w:p>
+    <w:p>
+      <w:pPr>
+        <w:spacing w:line="460" w:lineRule="exact"/>
+        <w:ind w:firstLine="480" w:firstLineChars="200"/>
+        <w:rPr>
+          <w:rFonts w:hint="eastAsia"/>
+          <w:sz w:val="24"/>
+        </w:rPr>
+      </w:pPr>
+    </w:p>
+    <w:p>
+      <w:pPr>
+        <w:spacing w:line="460" w:lineRule="exact"/>
+        <w:ind w:firstLine="480" w:firstLineChars="200"/>
+        <w:rPr>
+          <w:sz w:val="24"/>
+        </w:rPr>
+      </w:pPr>
+    </w:p>
+    <w:p>
+      <w:pPr>
+        <w:spacing w:before="0" w:after="0" w:line="20" w:lineRule="exact"/>
+        <w:ind w:firstLine="480" w:firstLineChars="200"/>
+        <w:rPr>
+          <w:sz w:val="24"/>
+        </w:rPr>
+      </w:pPr>
+    </w:p>
+    <w:p>
+      <w:pPr>
+        <w:spacing w:before="0" w:after="0" w:line="20" w:lineRule="exact"/>
         <w:ind w:firstLine="420" w:firstLineChars="200"/>
       </w:pPr>
     </w:p>
     <w:p>
       <w:pPr>
-        <w:spacing w:line="20" w:lineRule="exact" w:before="0" w:after="0"/>
+        <w:spacing w:before="0" w:after="0" w:line="20" w:lineRule="exact"/>
         <w:ind w:firstLine="420" w:firstLineChars="200"/>
       </w:pPr>
     </w:p>
     <w:p>
       <w:pPr>
-        <w:spacing w:line="20" w:lineRule="exact" w:before="0" w:after="0"/>
+        <w:spacing w:before="0" w:after="0" w:line="20" w:lineRule="exact"/>
         <w:ind w:firstLine="420" w:firstLineChars="200"/>
       </w:pPr>
     </w:p>
     <w:p>
       <w:pPr>
-        <w:spacing w:line="20" w:lineRule="exact" w:before="0" w:after="0"/>
+        <w:spacing w:before="0" w:after="0" w:line="20" w:lineRule="exact"/>
         <w:ind w:firstLine="420" w:firstLineChars="200"/>
       </w:pPr>
     </w:p>
     <w:p>
       <w:pPr>
-        <w:spacing w:line="20" w:lineRule="exact" w:before="0" w:after="0"/>
+        <w:spacing w:before="0" w:after="0" w:line="20" w:lineRule="exact"/>
         <w:ind w:firstLine="420" w:firstLineChars="200"/>
       </w:pPr>
     </w:p>
     <w:p>
       <w:pPr>
-        <w:spacing w:line="20" w:lineRule="exact" w:before="0" w:after="0"/>
+        <w:spacing w:before="0" w:after="0" w:line="20" w:lineRule="exact"/>
         <w:rPr>
           <w:rFonts w:hint="eastAsia" w:asciiTheme="minorEastAsia" w:hAnsiTheme="minorEastAsia" w:eastAsiaTheme="minorEastAsia"/>
           <w:sz w:val="24"/>
@@ -4581,30 +4690,36 @@
         <w:spacing w:line="460" w:lineRule="exact"/>
         <w:ind w:firstLine="480" w:firstLineChars="200"/>
         <w:rPr>
-          <w:sz w:val="24"/>
-        </w:rPr>
-      </w:pPr>
-      <w:r>
-        <w:rPr>
           <w:rFonts w:hint="eastAsia"/>
           <w:sz w:val="24"/>
         </w:rPr>
+      </w:pPr>
+      <w:r>
+        <w:rPr>
+          <w:rFonts w:hint="eastAsia"/>
+          <w:sz w:val="24"/>
+        </w:rPr>
         <w:t>学生用例图如图2-2所示。</w:t>
       </w:r>
     </w:p>
     <w:p>
       <w:pPr>
         <w:spacing w:line="460" w:lineRule="exact"/>
+        <w:ind w:firstLine="420" w:firstLineChars="200"/>
+        <w:rPr>
+          <w:rFonts w:hint="eastAsia"/>
+          <w:sz w:val="24"/>
+        </w:rPr>
       </w:pPr>
       <w:r>
         <w:drawing>
           <wp:anchor distT="0" distB="0" distL="114300" distR="114300" simplePos="0" relativeHeight="251660288" behindDoc="0" locked="0" layoutInCell="1" allowOverlap="1">
             <wp:simplePos x="0" y="0"/>
             <wp:positionH relativeFrom="column">
-              <wp:posOffset>1383030</wp:posOffset>
+              <wp:posOffset>849630</wp:posOffset>
             </wp:positionH>
             <wp:positionV relativeFrom="paragraph">
-              <wp:posOffset>102870</wp:posOffset>
+              <wp:posOffset>7620</wp:posOffset>
             </wp:positionV>
             <wp:extent cx="3301365" cy="2951480"/>
             <wp:effectExtent l="0" t="0" r="0" b="1270"/>
@@ -4657,63 +4772,160 @@
     </w:p>
     <w:p>
       <w:pPr>
-        <w:spacing w:line="20" w:lineRule="exact" w:before="0" w:after="0"/>
-      </w:pPr>
-    </w:p>
-    <w:p>
-      <w:pPr>
-        <w:spacing w:line="20" w:lineRule="exact" w:before="0" w:after="0"/>
-      </w:pPr>
-    </w:p>
-    <w:p>
-      <w:pPr>
-        <w:spacing w:line="20" w:lineRule="exact" w:before="0" w:after="0"/>
-      </w:pPr>
-    </w:p>
-    <w:p>
-      <w:pPr>
-        <w:spacing w:line="20" w:lineRule="exact" w:before="0" w:after="0"/>
-      </w:pPr>
-    </w:p>
-    <w:p>
-      <w:pPr>
-        <w:spacing w:line="20" w:lineRule="exact" w:before="0" w:after="0"/>
-      </w:pPr>
-    </w:p>
-    <w:p>
-      <w:pPr>
-        <w:spacing w:line="20" w:lineRule="exact" w:before="0" w:after="0"/>
-      </w:pPr>
-    </w:p>
-    <w:p>
-      <w:pPr>
-        <w:spacing w:line="20" w:lineRule="exact" w:before="0" w:after="0"/>
-      </w:pPr>
-    </w:p>
-    <w:p>
-      <w:pPr>
-        <w:spacing w:line="20" w:lineRule="exact" w:before="0" w:after="0"/>
-      </w:pPr>
-    </w:p>
-    <w:p>
-      <w:pPr>
-        <w:spacing w:line="20" w:lineRule="exact" w:before="0" w:after="0"/>
-      </w:pPr>
-    </w:p>
-    <w:p>
-      <w:pPr>
-        <w:spacing w:line="20" w:lineRule="exact" w:before="0" w:after="0"/>
-      </w:pPr>
-    </w:p>
-    <w:p>
-      <w:pPr>
-        <w:spacing w:line="460" w:lineRule="exact"/>
-      </w:pPr>
-      <w:r>
+        <w:spacing w:line="460" w:lineRule="exact"/>
+        <w:ind w:firstLine="480" w:firstLineChars="200"/>
         <w:rPr>
           <w:rFonts w:hint="eastAsia"/>
+          <w:sz w:val="24"/>
+        </w:rPr>
+      </w:pPr>
+    </w:p>
+    <w:p>
+      <w:pPr>
+        <w:spacing w:line="460" w:lineRule="exact"/>
+        <w:ind w:firstLine="480" w:firstLineChars="200"/>
+        <w:rPr>
+          <w:rFonts w:hint="eastAsia"/>
+          <w:sz w:val="24"/>
+        </w:rPr>
+      </w:pPr>
+    </w:p>
+    <w:p>
+      <w:pPr>
+        <w:spacing w:line="460" w:lineRule="exact"/>
+        <w:ind w:firstLine="480" w:firstLineChars="200"/>
+        <w:rPr>
+          <w:rFonts w:hint="eastAsia"/>
+          <w:sz w:val="24"/>
+        </w:rPr>
+      </w:pPr>
+    </w:p>
+    <w:p>
+      <w:pPr>
+        <w:spacing w:line="460" w:lineRule="exact"/>
+        <w:ind w:firstLine="480" w:firstLineChars="200"/>
+        <w:rPr>
+          <w:rFonts w:hint="eastAsia"/>
+          <w:sz w:val="24"/>
+        </w:rPr>
+      </w:pPr>
+    </w:p>
+    <w:p>
+      <w:pPr>
+        <w:spacing w:line="460" w:lineRule="exact"/>
+        <w:ind w:firstLine="480" w:firstLineChars="200"/>
+        <w:rPr>
+          <w:rFonts w:hint="eastAsia"/>
+          <w:sz w:val="24"/>
+        </w:rPr>
+      </w:pPr>
+    </w:p>
+    <w:p>
+      <w:pPr>
+        <w:spacing w:line="460" w:lineRule="exact"/>
+        <w:ind w:firstLine="480" w:firstLineChars="200"/>
+        <w:rPr>
+          <w:rFonts w:hint="eastAsia"/>
+          <w:sz w:val="24"/>
+        </w:rPr>
+      </w:pPr>
+    </w:p>
+    <w:p>
+      <w:pPr>
+        <w:spacing w:line="460" w:lineRule="exact"/>
+        <w:ind w:firstLine="480" w:firstLineChars="200"/>
+        <w:rPr>
+          <w:rFonts w:hint="eastAsia"/>
+          <w:sz w:val="24"/>
+        </w:rPr>
+      </w:pPr>
+    </w:p>
+    <w:p>
+      <w:pPr>
+        <w:spacing w:line="460" w:lineRule="exact"/>
+        <w:ind w:firstLine="480" w:firstLineChars="200"/>
+        <w:rPr>
+          <w:rFonts w:hint="eastAsia"/>
+          <w:sz w:val="24"/>
+        </w:rPr>
+      </w:pPr>
+    </w:p>
+    <w:p>
+      <w:pPr>
+        <w:spacing w:line="460" w:lineRule="exact"/>
+      </w:pPr>
+    </w:p>
+    <w:p>
+      <w:pPr>
+        <w:spacing w:before="0" w:after="0" w:line="20" w:lineRule="exact"/>
+      </w:pPr>
+    </w:p>
+    <w:p>
+      <w:pPr>
+        <w:spacing w:before="0" w:after="0" w:line="20" w:lineRule="exact"/>
+      </w:pPr>
+    </w:p>
+    <w:p>
+      <w:pPr>
+        <w:spacing w:before="0" w:after="0" w:line="20" w:lineRule="exact"/>
+      </w:pPr>
+    </w:p>
+    <w:p>
+      <w:pPr>
+        <w:spacing w:before="0" w:after="0" w:line="20" w:lineRule="exact"/>
+      </w:pPr>
+    </w:p>
+    <w:p>
+      <w:pPr>
+        <w:spacing w:before="0" w:after="0" w:line="20" w:lineRule="exact"/>
+      </w:pPr>
+    </w:p>
+    <w:p>
+      <w:pPr>
+        <w:spacing w:before="0" w:after="0" w:line="20" w:lineRule="exact"/>
+      </w:pPr>
+    </w:p>
+    <w:p>
+      <w:pPr>
+        <w:spacing w:before="0" w:after="0" w:line="20" w:lineRule="exact"/>
+      </w:pPr>
+    </w:p>
+    <w:p>
+      <w:pPr>
+        <w:spacing w:before="0" w:after="0" w:line="20" w:lineRule="exact"/>
+      </w:pPr>
+    </w:p>
+    <w:p>
+      <w:pPr>
+        <w:spacing w:before="0" w:after="0" w:line="20" w:lineRule="exact"/>
+      </w:pPr>
+    </w:p>
+    <w:p>
+      <w:pPr>
+        <w:spacing w:before="0" w:after="0" w:line="20" w:lineRule="exact"/>
+      </w:pPr>
+    </w:p>
+    <w:p>
+      <w:pPr>
+        <w:spacing w:line="460" w:lineRule="exact"/>
+        <w:ind w:firstLine="2310" w:firstLineChars="1100"/>
+        <w:rPr>
+          <w:rFonts w:hint="default"/>
+          <w:lang w:val="en-US"/>
+        </w:rPr>
+      </w:pPr>
+      <w:r>
+        <w:rPr>
+          <w:rFonts w:hint="eastAsia"/>
         </w:rPr>
         <w:t>图 2-2 学生用户用例图</w:t>
+      </w:r>
+      <w:r>
+        <w:rPr>
+          <w:rFonts w:hint="default"/>
+          <w:lang w:val="en-US"/>
+        </w:rPr>
+        <w:t xml:space="preserve">     </w:t>
       </w:r>
     </w:p>
     <w:p>
@@ -6145,6 +6357,8 @@
         </w:rPr>
         <w:t>图 3-1 系统总体功能模块图</w:t>
       </w:r>
+      <w:bookmarkStart w:id="53" w:name="_GoBack"/>
+      <w:bookmarkEnd w:id="53"/>
     </w:p>
     <w:p>
       <w:pPr>
@@ -13850,7 +14064,7 @@
 </file>
 
 <file path=customXml/item1.xml><?xml version="1.0" encoding="utf-8"?>
-<b:Sources xmlns:b="http://schemas.openxmlformats.org/officeDocument/2006/bibliography" xmlns="http://schemas.openxmlformats.org/officeDocument/2006/bibliography" StyleName="APA" SelectedStyle="\APASixthEditionOfficeOnline.xsl" Version="6"/>
+<b:Sources xmlns:b="http://schemas.openxmlformats.org/officeDocument/2006/bibliography" xmlns="http://schemas.openxmlformats.org/officeDocument/2006/bibliography" SelectedStyle="\APASixthEditionOfficeOnline.xsl" Version="6" StyleName="APA"/>
 </file>
 
 <file path=customXml/itemProps1.xml><?xml version="1.0" encoding="utf-8"?>

</xml_diff>